<commit_message>
Add Windows migration and PC transfer workflow
</commit_message>
<xml_diff>
--- a/src/reportgen/templates/報告書_ひな形_v2.docx
+++ b/src/reportgen/templates/報告書_ひな形_v2.docx
@@ -2156,7 +2156,9 @@
           <w:rFonts w:hint="eastAsia"/>
           <w:color w:val="000000" w:themeColor="text1"/>
         </w:rPr>
-        <w:t>技術担当：株式会社地研テクノ</w:t>
+      </w:r>
+      <w:r>
+        <w:t>技術担当：{{ survey_company_name }}</w:t>
       </w:r>
     </w:p>
     <w:p>
@@ -2170,21 +2172,21 @@
           <w:rFonts w:hint="eastAsia"/>
           <w:color w:val="000000" w:themeColor="text1"/>
         </w:rPr>
-        <w:t xml:space="preserve">　　　　　　</w:t>
       </w:r>
       <w:r>
         <w:rPr>
           <w:rFonts w:hint="eastAsia"/>
           <w:color w:val="000000" w:themeColor="text1"/>
         </w:rPr>
-        <w:t>大阪府</w:t>
       </w:r>
       <w:r>
         <w:rPr>
           <w:rFonts w:hint="eastAsia"/>
           <w:color w:val="000000" w:themeColor="text1"/>
         </w:rPr>
-        <w:t>大阪市淀川区宮原2-1-39</w:t>
+      </w:r>
+      <w:r>
+        <w:t xml:space="preserve">　　　　　　{{ survey_company_address }}</w:t>
       </w:r>
     </w:p>
     <w:p>
@@ -2198,7 +2200,9 @@
           <w:rFonts w:hint="eastAsia"/>
           <w:color w:val="000000" w:themeColor="text1"/>
         </w:rPr>
-        <w:t xml:space="preserve">　　　        TEL (06)6396-0022 　FAX (06)6396-0033</w:t>
+      </w:r>
+      <w:r>
+        <w:t xml:space="preserve">　　　　　　　TEL{{ survey_company_tel }}　　FAX{{ survey_company_fax }}</w:t>
       </w:r>
     </w:p>
     <w:p>

</xml_diff>